<commit_message>
Refresh resume layout and content
</commit_message>
<xml_diff>
--- a/public/resume.docx
+++ b/public/resume.docx
@@ -123,6 +123,23 @@
         <w:t xml:space="preserve">| </w:t>
       </w:r>
       <w:hyperlink r:id="rId8" w:history="1">
+        <w:r>
+          <w:rPr>
+            <w:rStyle w:val="Hyperlink"/>
+            <w:sz w:val="18"/>
+            <w:szCs w:val="18"/>
+          </w:rPr>
+          <w:t>hoaangngo.com</w:t>
+        </w:r>
+      </w:hyperlink>
+      <w:r>
+        <w:rPr>
+          <w:sz w:val="18"/>
+          <w:szCs w:val="18"/>
+        </w:rPr>
+        <w:t xml:space="preserve"> | </w:t>
+      </w:r>
+      <w:hyperlink r:id="rId9" w:history="1">
         <w:r>
           <w:rPr>
             <w:rStyle w:val="Hyperlink"/>
@@ -155,7 +172,7 @@
         </w:rPr>
         <w:t xml:space="preserve"> | </w:t>
       </w:r>
-      <w:hyperlink r:id="rId9" w:history="1">
+      <w:hyperlink r:id="rId10" w:history="1">
         <w:r>
           <w:rPr>
             <w:rStyle w:val="Hyperlink"/>
@@ -192,13 +209,13 @@
     <w:tbl>
       <w:tblPr>
         <w:tblStyle w:val="TableGrid"/>
-        <w:tblW w:w="10476" w:type="dxa"/>
+        <w:tblW w:w="10584" w:type="dxa"/>
         <w:tblInd w:w="216" w:type="dxa"/>
         <w:tblLook w:val="04A0" w:firstRow="1" w:lastRow="0" w:firstColumn="1" w:lastColumn="0" w:noHBand="0" w:noVBand="1"/>
       </w:tblPr>
       <w:tblGrid>
         <w:gridCol w:w="7528"/>
-        <w:gridCol w:w="2948"/>
+        <w:gridCol w:w="3056"/>
       </w:tblGrid>
       <w:tr>
         <w:trPr>
@@ -235,7 +252,7 @@
         </w:tc>
         <w:tc>
           <w:tcPr>
-            <w:tcW w:w="2948" w:type="dxa"/>
+            <w:tcW w:w="3056" w:type="dxa"/>
             <w:tcBorders>
               <w:top w:val="nil"/>
               <w:left w:val="nil"/>
@@ -298,7 +315,7 @@
         </w:tc>
         <w:tc>
           <w:tcPr>
-            <w:tcW w:w="2948" w:type="dxa"/>
+            <w:tcW w:w="3056" w:type="dxa"/>
             <w:tcBorders>
               <w:top w:val="nil"/>
               <w:left w:val="nil"/>
@@ -309,13 +326,29 @@
           <w:p>
             <w:pPr>
               <w:spacing w:after="0" w:line="240" w:lineRule="auto"/>
-              <w:ind w:left="720" w:right="27" w:firstLine="0"/>
+              <w:ind w:left="-7560" w:firstLine="0"/>
               <w:jc w:val="right"/>
               <w:rPr>
                 <w:sz w:val="18"/>
                 <w:szCs w:val="18"/>
               </w:rPr>
             </w:pPr>
+            <w:r>
+              <w:rPr>
+                <w:i/>
+                <w:sz w:val="18"/>
+                <w:szCs w:val="18"/>
+              </w:rPr>
+              <w:t xml:space="preserve">                 </w:t>
+            </w:r>
+            <w:r>
+              <w:rPr>
+                <w:i/>
+                <w:sz w:val="18"/>
+                <w:szCs w:val="18"/>
+              </w:rPr>
+              <w:t xml:space="preserve">         </w:t>
+            </w:r>
             <w:r>
               <w:rPr>
                 <w:i/>
@@ -386,7 +419,26 @@
               <w:spacing w:after="0" w:line="240" w:lineRule="auto"/>
               <w:ind w:left="0" w:firstLine="0"/>
               <w:rPr>
-                <w:i/>
+                <w:iCs/>
+                <w:sz w:val="18"/>
+                <w:szCs w:val="18"/>
+              </w:rPr>
+            </w:pPr>
+            <w:r>
+              <w:rPr>
+                <w:iCs/>
+                <w:sz w:val="18"/>
+                <w:szCs w:val="18"/>
+              </w:rPr>
+              <w:t>Affiliations: Break Through Tech</w:t>
+            </w:r>
+          </w:p>
+          <w:p>
+            <w:pPr>
+              <w:spacing w:after="0" w:line="240" w:lineRule="auto"/>
+              <w:ind w:left="0" w:firstLine="0"/>
+              <w:rPr>
+                <w:iCs/>
                 <w:sz w:val="18"/>
                 <w:szCs w:val="18"/>
               </w:rPr>
@@ -395,7 +447,7 @@
         </w:tc>
         <w:tc>
           <w:tcPr>
-            <w:tcW w:w="2948" w:type="dxa"/>
+            <w:tcW w:w="3056" w:type="dxa"/>
             <w:tcBorders>
               <w:top w:val="nil"/>
               <w:left w:val="nil"/>
@@ -452,7 +504,7 @@
         </w:tc>
         <w:tc>
           <w:tcPr>
-            <w:tcW w:w="2948" w:type="dxa"/>
+            <w:tcW w:w="3056" w:type="dxa"/>
             <w:tcBorders>
               <w:top w:val="nil"/>
               <w:left w:val="nil"/>
@@ -475,7 +527,21 @@
                 <w:sz w:val="18"/>
                 <w:szCs w:val="18"/>
               </w:rPr>
-              <w:t>Desplaines  IL</w:t>
+              <w:t>Des</w:t>
+            </w:r>
+            <w:r>
+              <w:rPr>
+                <w:sz w:val="18"/>
+                <w:szCs w:val="18"/>
+              </w:rPr>
+              <w:t xml:space="preserve"> P</w:t>
+            </w:r>
+            <w:r>
+              <w:rPr>
+                <w:sz w:val="18"/>
+                <w:szCs w:val="18"/>
+              </w:rPr>
+              <w:t>laines  IL</w:t>
             </w:r>
           </w:p>
         </w:tc>
@@ -497,7 +563,7 @@
           <w:p>
             <w:pPr>
               <w:spacing w:after="0" w:line="240" w:lineRule="auto"/>
-              <w:ind w:left="0" w:firstLine="0"/>
+              <w:ind w:left="0" w:right="4500" w:firstLine="0"/>
               <w:rPr>
                 <w:sz w:val="18"/>
                 <w:szCs w:val="18"/>
@@ -515,7 +581,7 @@
         </w:tc>
         <w:tc>
           <w:tcPr>
-            <w:tcW w:w="2948" w:type="dxa"/>
+            <w:tcW w:w="3056" w:type="dxa"/>
             <w:tcBorders>
               <w:top w:val="nil"/>
               <w:left w:val="nil"/>
@@ -526,7 +592,7 @@
           <w:p>
             <w:pPr>
               <w:spacing w:after="0" w:line="240" w:lineRule="auto"/>
-              <w:ind w:left="0" w:right="27" w:firstLine="0"/>
+              <w:ind w:left="-7560" w:firstLine="0"/>
               <w:jc w:val="right"/>
               <w:rPr>
                 <w:i/>
@@ -535,6 +601,15 @@
                 <w:szCs w:val="18"/>
               </w:rPr>
             </w:pPr>
+            <w:r>
+              <w:rPr>
+                <w:i/>
+                <w:iCs/>
+                <w:sz w:val="18"/>
+                <w:szCs w:val="18"/>
+              </w:rPr>
+              <w:t xml:space="preserve">                   </w:t>
+            </w:r>
             <w:r>
               <w:rPr>
                 <w:i/>
@@ -584,7 +659,7 @@
         </w:tc>
         <w:tc>
           <w:tcPr>
-            <w:tcW w:w="2948" w:type="dxa"/>
+            <w:tcW w:w="3056" w:type="dxa"/>
             <w:tcBorders>
               <w:top w:val="nil"/>
               <w:left w:val="nil"/>
@@ -708,6 +783,141 @@
     </w:p>
     <w:p>
       <w:pPr>
+        <w:spacing w:line="240" w:lineRule="auto"/>
+        <w:ind w:left="226"/>
+        <w:jc w:val="both"/>
+        <w:rPr>
+          <w:b/>
+          <w:bCs/>
+          <w:sz w:val="18"/>
+          <w:szCs w:val="18"/>
+        </w:rPr>
+      </w:pPr>
+      <w:r>
+        <w:rPr>
+          <w:b/>
+          <w:bCs/>
+          <w:sz w:val="18"/>
+          <w:szCs w:val="18"/>
+        </w:rPr>
+        <w:t>Certifications</w:t>
+      </w:r>
+    </w:p>
+    <w:p>
+      <w:pPr>
+        <w:spacing w:line="240" w:lineRule="auto"/>
+        <w:ind w:left="236" w:right="-7"/>
+        <w:jc w:val="both"/>
+        <w:rPr>
+          <w:b/>
+          <w:bCs/>
+          <w:i/>
+          <w:iCs/>
+          <w:sz w:val="18"/>
+          <w:szCs w:val="18"/>
+        </w:rPr>
+      </w:pPr>
+      <w:r>
+        <w:rPr>
+          <w:b/>
+          <w:bCs/>
+          <w:sz w:val="18"/>
+          <w:szCs w:val="18"/>
+        </w:rPr>
+        <w:t>Cornell University</w:t>
+      </w:r>
+      <w:r>
+        <w:rPr>
+          <w:b/>
+          <w:bCs/>
+          <w:sz w:val="18"/>
+          <w:szCs w:val="18"/>
+        </w:rPr>
+        <w:t>,</w:t>
+      </w:r>
+      <w:r>
+        <w:rPr>
+          <w:b/>
+          <w:bCs/>
+          <w:sz w:val="18"/>
+          <w:szCs w:val="18"/>
+        </w:rPr>
+        <w:t xml:space="preserve"> </w:t>
+      </w:r>
+      <w:r>
+        <w:rPr>
+          <w:sz w:val="18"/>
+          <w:szCs w:val="18"/>
+        </w:rPr>
+        <w:t>online</w:t>
+      </w:r>
+      <w:r>
+        <w:rPr>
+          <w:sz w:val="18"/>
+          <w:szCs w:val="18"/>
+        </w:rPr>
+        <w:t xml:space="preserve"> certificate in</w:t>
+      </w:r>
+      <w:r>
+        <w:rPr>
+          <w:sz w:val="18"/>
+          <w:szCs w:val="18"/>
+        </w:rPr>
+        <w:t xml:space="preserve"> Machine Learning Foundations</w:t>
+      </w:r>
+      <w:r>
+        <w:rPr>
+          <w:sz w:val="18"/>
+          <w:szCs w:val="18"/>
+        </w:rPr>
+        <w:t xml:space="preserve">                                                                                    </w:t>
+      </w:r>
+      <w:r>
+        <w:rPr>
+          <w:sz w:val="18"/>
+          <w:szCs w:val="18"/>
+        </w:rPr>
+        <w:t xml:space="preserve">                          </w:t>
+      </w:r>
+      <w:r>
+        <w:rPr>
+          <w:sz w:val="18"/>
+          <w:szCs w:val="18"/>
+        </w:rPr>
+        <w:t xml:space="preserve">  </w:t>
+      </w:r>
+      <w:r>
+        <w:rPr>
+          <w:i/>
+          <w:iCs/>
+          <w:sz w:val="18"/>
+          <w:szCs w:val="18"/>
+        </w:rPr>
+        <w:t>July 202</w:t>
+      </w:r>
+      <w:r>
+        <w:rPr>
+          <w:i/>
+          <w:iCs/>
+          <w:sz w:val="18"/>
+          <w:szCs w:val="18"/>
+        </w:rPr>
+        <w:t>6</w:t>
+      </w:r>
+    </w:p>
+    <w:p>
+      <w:pPr>
+        <w:spacing w:line="240" w:lineRule="auto"/>
+        <w:ind w:left="226"/>
+        <w:jc w:val="both"/>
+        <w:rPr>
+          <w:sz w:val="18"/>
+          <w:szCs w:val="18"/>
+        </w:rPr>
+      </w:pPr>
+    </w:p>
+    <w:p>
+      <w:pPr>
         <w:pStyle w:val="Heading1"/>
         <w:pBdr>
           <w:bottom w:val="single" w:sz="6" w:space="1" w:color="auto"/>
@@ -740,29 +950,81 @@
       </w:pPr>
       <w:r>
         <w:rPr>
-          <w:sz w:val="18"/>
-          <w:szCs w:val="18"/>
-        </w:rPr>
-        <w:t xml:space="preserve">Programming Languages: </w:t>
-      </w:r>
-      <w:r>
-        <w:rPr>
           <w:b/>
           <w:bCs/>
           <w:sz w:val="18"/>
           <w:szCs w:val="18"/>
         </w:rPr>
+        <w:t>Programming Languages:</w:t>
+      </w:r>
+      <w:r>
+        <w:rPr>
+          <w:sz w:val="18"/>
+          <w:szCs w:val="18"/>
+        </w:rPr>
+        <w:t xml:space="preserve"> </w:t>
+      </w:r>
+      <w:r>
+        <w:rPr>
+          <w:sz w:val="18"/>
+          <w:szCs w:val="18"/>
+        </w:rPr>
         <w:t xml:space="preserve">Python, C/C++, </w:t>
       </w:r>
       <w:r>
+        <w:rPr>
+          <w:sz w:val="18"/>
+          <w:szCs w:val="18"/>
+        </w:rPr>
+        <w:t xml:space="preserve">Java, </w:t>
+      </w:r>
+      <w:r>
+        <w:rPr>
+          <w:sz w:val="18"/>
+          <w:szCs w:val="18"/>
+        </w:rPr>
+        <w:t>JavaScript</w:t>
+      </w:r>
+      <w:r>
+        <w:rPr>
+          <w:sz w:val="18"/>
+          <w:szCs w:val="18"/>
+        </w:rPr>
+        <w:t>,</w:t>
+      </w:r>
+      <w:r>
+        <w:rPr>
+          <w:sz w:val="18"/>
+          <w:szCs w:val="18"/>
+        </w:rPr>
+        <w:t xml:space="preserve"> HTML, CSS</w:t>
+      </w:r>
+      <w:r>
+        <w:rPr>
+          <w:sz w:val="18"/>
+          <w:szCs w:val="18"/>
+        </w:rPr>
+        <w:t>, SQLite</w:t>
+      </w:r>
+      <w:r>
+        <w:rPr>
+          <w:sz w:val="18"/>
+          <w:szCs w:val="18"/>
+        </w:rPr>
+        <w:t>, Bash</w:t>
+      </w:r>
+    </w:p>
+    <w:p>
+      <w:pPr>
+        <w:spacing w:line="240" w:lineRule="auto"/>
+        <w:ind w:left="180" w:firstLine="0"/>
         <w:rPr>
           <w:b/>
           <w:bCs/>
           <w:sz w:val="18"/>
           <w:szCs w:val="18"/>
         </w:rPr>
-        <w:t xml:space="preserve">Java, </w:t>
-      </w:r>
+      </w:pPr>
       <w:r>
         <w:rPr>
           <w:b/>
@@ -770,17 +1032,62 @@
           <w:sz w:val="18"/>
           <w:szCs w:val="18"/>
         </w:rPr>
-        <w:t>JavaScript</w:t>
-      </w:r>
-      <w:r>
+        <w:t>Frameworks/Libraries:</w:t>
+      </w:r>
+      <w:r>
+        <w:rPr>
+          <w:sz w:val="18"/>
+          <w:szCs w:val="18"/>
+        </w:rPr>
+        <w:t xml:space="preserve"> </w:t>
+      </w:r>
+      <w:r>
+        <w:rPr>
+          <w:sz w:val="18"/>
+          <w:szCs w:val="18"/>
+        </w:rPr>
+        <w:t xml:space="preserve">React, Bootstrap, </w:t>
+      </w:r>
+      <w:r>
+        <w:rPr>
+          <w:sz w:val="18"/>
+          <w:szCs w:val="18"/>
+        </w:rPr>
+        <w:t>Node.js</w:t>
+      </w:r>
+      <w:r>
+        <w:rPr>
+          <w:sz w:val="18"/>
+          <w:szCs w:val="18"/>
+        </w:rPr>
+        <w:t>, p5</w:t>
+      </w:r>
+      <w:r>
+        <w:rPr>
+          <w:sz w:val="18"/>
+          <w:szCs w:val="18"/>
+        </w:rPr>
+        <w:t>.js</w:t>
+      </w:r>
+      <w:r>
+        <w:rPr>
+          <w:sz w:val="18"/>
+          <w:szCs w:val="18"/>
+        </w:rPr>
+        <w:t>, Tailwind CSS, Pandas, NumPy, Scikit-learn, Seaborn</w:t>
+      </w:r>
+    </w:p>
+    <w:p>
+      <w:pPr>
+        <w:spacing w:line="240" w:lineRule="auto"/>
+        <w:ind w:left="180" w:firstLine="0"/>
         <w:rPr>
           <w:b/>
           <w:bCs/>
           <w:sz w:val="18"/>
           <w:szCs w:val="18"/>
         </w:rPr>
-        <w:t>,</w:t>
-      </w:r>
+      </w:pPr>
       <w:r>
         <w:rPr>
           <w:b/>
@@ -788,7 +1095,7 @@
           <w:sz w:val="18"/>
           <w:szCs w:val="18"/>
         </w:rPr>
-        <w:t xml:space="preserve"> HTML, CSS</w:t>
+        <w:t>Tools/Platforms</w:t>
       </w:r>
       <w:r>
         <w:rPr>
@@ -797,95 +1104,17 @@
           <w:sz w:val="18"/>
           <w:szCs w:val="18"/>
         </w:rPr>
-        <w:t>, SQLite</w:t>
-      </w:r>
-      <w:r>
-        <w:rPr>
-          <w:b/>
-          <w:bCs/>
-          <w:sz w:val="18"/>
-          <w:szCs w:val="18"/>
-        </w:rPr>
-        <w:t>, Bash</w:t>
-      </w:r>
-    </w:p>
-    <w:p>
-      <w:pPr>
-        <w:spacing w:line="240" w:lineRule="auto"/>
-        <w:ind w:left="180" w:firstLine="0"/>
-        <w:rPr>
-          <w:b/>
-          <w:bCs/>
-          <w:sz w:val="18"/>
-          <w:szCs w:val="18"/>
-        </w:rPr>
-      </w:pPr>
-      <w:r>
-        <w:rPr>
-          <w:sz w:val="18"/>
-          <w:szCs w:val="18"/>
-        </w:rPr>
-        <w:t xml:space="preserve">Frameworks/Libraries: </w:t>
-      </w:r>
-      <w:r>
-        <w:rPr>
-          <w:b/>
-          <w:bCs/>
-          <w:sz w:val="18"/>
-          <w:szCs w:val="18"/>
-        </w:rPr>
-        <w:t xml:space="preserve">React, Bootstrap, </w:t>
-      </w:r>
-      <w:r>
-        <w:rPr>
-          <w:b/>
-          <w:bCs/>
-          <w:sz w:val="18"/>
-          <w:szCs w:val="18"/>
-        </w:rPr>
-        <w:t>Node.js</w:t>
-      </w:r>
-      <w:r>
-        <w:rPr>
-          <w:b/>
-          <w:bCs/>
-          <w:sz w:val="18"/>
-          <w:szCs w:val="18"/>
-        </w:rPr>
-        <w:t>, p5</w:t>
-      </w:r>
-      <w:r>
-        <w:rPr>
-          <w:b/>
-          <w:bCs/>
-          <w:sz w:val="18"/>
-          <w:szCs w:val="18"/>
-        </w:rPr>
-        <w:t>.js</w:t>
-      </w:r>
-    </w:p>
-    <w:p>
-      <w:pPr>
-        <w:spacing w:line="240" w:lineRule="auto"/>
-        <w:ind w:left="180" w:firstLine="0"/>
-        <w:rPr>
-          <w:b/>
-          <w:bCs/>
-          <w:sz w:val="18"/>
-          <w:szCs w:val="18"/>
-        </w:rPr>
-      </w:pPr>
-      <w:r>
-        <w:rPr>
-          <w:sz w:val="18"/>
-          <w:szCs w:val="18"/>
-        </w:rPr>
-        <w:t xml:space="preserve">Software/Tools: </w:t>
-      </w:r>
-      <w:r>
-        <w:rPr>
-          <w:b/>
-          <w:bCs/>
+        <w:t>:</w:t>
+      </w:r>
+      <w:r>
+        <w:rPr>
+          <w:sz w:val="18"/>
+          <w:szCs w:val="18"/>
+        </w:rPr>
+        <w:t xml:space="preserve"> </w:t>
+      </w:r>
+      <w:r>
+        <w:rPr>
           <w:sz w:val="18"/>
           <w:szCs w:val="18"/>
         </w:rPr>
@@ -893,8 +1122,6 @@
       </w:r>
       <w:r>
         <w:rPr>
-          <w:b/>
-          <w:bCs/>
           <w:sz w:val="18"/>
           <w:szCs w:val="18"/>
         </w:rPr>
@@ -902,8 +1129,6 @@
       </w:r>
       <w:r>
         <w:rPr>
-          <w:b/>
-          <w:bCs/>
           <w:sz w:val="18"/>
           <w:szCs w:val="18"/>
         </w:rPr>
@@ -911,8 +1136,6 @@
       </w:r>
       <w:r>
         <w:rPr>
-          <w:b/>
-          <w:bCs/>
           <w:sz w:val="18"/>
           <w:szCs w:val="18"/>
         </w:rPr>
@@ -920,8 +1143,6 @@
       </w:r>
       <w:r>
         <w:rPr>
-          <w:b/>
-          <w:bCs/>
           <w:sz w:val="18"/>
           <w:szCs w:val="18"/>
         </w:rPr>
@@ -929,8 +1150,6 @@
       </w:r>
       <w:r>
         <w:rPr>
-          <w:b/>
-          <w:bCs/>
           <w:sz w:val="18"/>
           <w:szCs w:val="18"/>
         </w:rPr>
@@ -938,12 +1157,24 @@
       </w:r>
       <w:r>
         <w:rPr>
-          <w:b/>
-          <w:bCs/>
           <w:sz w:val="18"/>
           <w:szCs w:val="18"/>
         </w:rPr>
         <w:t>IntelliJ</w:t>
+      </w:r>
+      <w:r>
+        <w:rPr>
+          <w:sz w:val="18"/>
+          <w:szCs w:val="18"/>
+        </w:rPr>
+        <w:t>, Figma</w:t>
+      </w:r>
+      <w:r>
+        <w:rPr>
+          <w:sz w:val="18"/>
+          <w:szCs w:val="18"/>
+        </w:rPr>
+        <w:t>, Raspberrypi</w:t>
       </w:r>
     </w:p>
     <w:p>
@@ -996,7 +1227,7 @@
           <w:szCs w:val="18"/>
         </w:rPr>
       </w:pPr>
-      <w:hyperlink r:id="rId10" w:history="1">
+      <w:hyperlink r:id="rId11" w:history="1">
         <w:r>
           <w:rPr>
             <w:rStyle w:val="Hyperlink"/>
@@ -1168,32 +1399,6 @@
           <w:sz w:val="18"/>
           <w:szCs w:val="18"/>
         </w:rPr>
-        <w:t>Integrated TanStack React Query for efficient server state caching and RESTful API consumption with Axios HTTP client</w:t>
-      </w:r>
-    </w:p>
-    <w:p>
-      <w:pPr>
-        <w:pStyle w:val="ListParagraph"/>
-        <w:numPr>
-          <w:ilvl w:val="0"/>
-          <w:numId w:val="14"/>
-        </w:numPr>
-        <w:tabs>
-          <w:tab w:val="center" w:pos="2209"/>
-          <w:tab w:val="right" w:pos="10793"/>
-        </w:tabs>
-        <w:spacing w:after="1" w:line="240" w:lineRule="auto"/>
-        <w:ind w:left="450"/>
-        <w:rPr>
-          <w:sz w:val="18"/>
-          <w:szCs w:val="18"/>
-        </w:rPr>
-      </w:pPr>
-      <w:r>
-        <w:rPr>
-          <w:sz w:val="18"/>
-          <w:szCs w:val="18"/>
-        </w:rPr>
         <w:t>Built reusable components including AuthGuard route protection, file upload modals, and responsive navigation with Bootstrap</w:t>
       </w:r>
     </w:p>
@@ -1230,7 +1435,7 @@
           <w:szCs w:val="18"/>
         </w:rPr>
       </w:pPr>
-      <w:hyperlink r:id="rId11" w:history="1">
+      <w:hyperlink r:id="rId12" w:history="1">
         <w:r>
           <w:rPr>
             <w:rStyle w:val="Hyperlink"/>
@@ -1452,7 +1657,7 @@
           <w:szCs w:val="18"/>
         </w:rPr>
       </w:pPr>
-      <w:hyperlink r:id="rId12" w:history="1">
+      <w:hyperlink r:id="rId13" w:history="1">
         <w:r>
           <w:rPr>
             <w:rStyle w:val="Hyperlink"/>
@@ -1575,7 +1780,7 @@
           <w:sz w:val="18"/>
           <w:szCs w:val="18"/>
         </w:rPr>
-        <w:t>Engineered a recursive threaded comment system supporting nested replies with collapsible threads and O(n) tree construction.</w:t>
+        <w:t>Engineered a recursive threaded comment system supporting nested replies with collapsible threads and O(n) tree construction</w:t>
       </w:r>
     </w:p>
     <w:p>
@@ -1602,7 +1807,7 @@
           <w:sz w:val="18"/>
           <w:szCs w:val="18"/>
         </w:rPr>
-        <w:t>Implemented optimistic UI with server-authoritative state synchronization via Supabase RPC for real-time upvote toggling.</w:t>
+        <w:t>Implemented optimistic UI with server-authoritative state synchronization via Supabase RPC for real-time upvote toggling</w:t>
       </w:r>
     </w:p>
     <w:p>
@@ -1629,7 +1834,7 @@
           <w:sz w:val="18"/>
           <w:szCs w:val="18"/>
         </w:rPr>
-        <w:t>Built infinite scroll pagination using IntersectionObserver with race condition guards and 300ms debounced server-side search.</w:t>
+        <w:t>Built infinite scroll pagination using IntersectionObserver with race condition guards and 300ms debounced server-side search</w:t>
       </w:r>
     </w:p>
     <w:p>
@@ -1663,7 +1868,7 @@
           <w:szCs w:val="18"/>
         </w:rPr>
       </w:pPr>
-      <w:hyperlink r:id="rId13" w:history="1">
+      <w:hyperlink r:id="rId14" w:history="1">
         <w:r>
           <w:rPr>
             <w:rStyle w:val="Hyperlink"/>
@@ -1691,7 +1896,7 @@
           <w:sz w:val="18"/>
           <w:szCs w:val="18"/>
         </w:rPr>
-        <w:t xml:space="preserve"> HTML, CSS, JavaScript, GSAP, Webpack, Supabase, Git, Cloudflare</w:t>
+        <w:t xml:space="preserve"> HTML, CSS, JavaScript, GSAP, Webpack, Supabase, Git</w:t>
       </w:r>
       <w:r>
         <w:rPr>
@@ -1823,7 +2028,21 @@
           <w:sz w:val="18"/>
           <w:szCs w:val="18"/>
         </w:rPr>
-        <w:t>Set up a Webpack build pipeline for bundled entry points and static asset handling, then deploy and managed by Cloudflare DNS</w:t>
+        <w:t xml:space="preserve">Set up a Webpack build pipeline for bundled entry points and static asset handling, then deploy and managed by </w:t>
+      </w:r>
+      <w:r>
+        <w:rPr>
+          <w:sz w:val="18"/>
+          <w:szCs w:val="18"/>
+        </w:rPr>
+        <w:t xml:space="preserve">Github </w:t>
+      </w:r>
+      <w:r>
+        <w:rPr>
+          <w:sz w:val="18"/>
+          <w:szCs w:val="18"/>
+        </w:rPr>
+        <w:t>Action</w:t>
       </w:r>
     </w:p>
     <w:p>
@@ -1851,7 +2070,6 @@
           <w:rFonts w:ascii="Cambria" w:hAnsi="Cambria"/>
           <w:sz w:val="18"/>
           <w:szCs w:val="18"/>
-          <w:lang w:val="vi-VN"/>
         </w:rPr>
       </w:pPr>
       <w:r>
@@ -1860,32 +2078,7 @@
           <w:sz w:val="18"/>
           <w:szCs w:val="18"/>
         </w:rPr>
-        <w:t>Activit</w:t>
-      </w:r>
-      <w:r>
-        <w:rPr>
-          <w:rFonts w:ascii="Cambria" w:hAnsi="Cambria"/>
-          <w:sz w:val="18"/>
-          <w:szCs w:val="18"/>
-        </w:rPr>
-        <w:t>i</w:t>
-      </w:r>
-      <w:r>
-        <w:rPr>
-          <w:rFonts w:ascii="Cambria" w:hAnsi="Cambria"/>
-          <w:sz w:val="18"/>
-          <w:szCs w:val="18"/>
-        </w:rPr>
-        <w:t>es</w:t>
-      </w:r>
-      <w:r>
-        <w:rPr>
-          <w:rFonts w:ascii="Cambria" w:hAnsi="Cambria"/>
-          <w:sz w:val="18"/>
-          <w:szCs w:val="18"/>
-          <w:lang w:val="vi-VN"/>
-        </w:rPr>
-        <w:t xml:space="preserve"> and Interests</w:t>
+        <w:t>Leadership and activities</w:t>
       </w:r>
     </w:p>
     <w:p>
@@ -1910,16 +2103,7 @@
           <w:sz w:val="18"/>
           <w:szCs w:val="18"/>
         </w:rPr>
-        <w:t xml:space="preserve">Conference volunteer </w:t>
-      </w:r>
-      <w:r>
-        <w:rPr>
-          <w:b/>
-          <w:bCs/>
-          <w:sz w:val="18"/>
-          <w:szCs w:val="18"/>
-        </w:rPr>
-        <w:t xml:space="preserve"> |</w:t>
+        <w:t>Break Through Tech Fellow</w:t>
       </w:r>
       <w:r>
         <w:rPr>
@@ -1928,24 +2112,6 @@
           <w:sz w:val="18"/>
           <w:szCs w:val="18"/>
         </w:rPr>
-        <w:t xml:space="preserve"> </w:t>
-      </w:r>
-      <w:r>
-        <w:rPr>
-          <w:i/>
-          <w:iCs/>
-          <w:sz w:val="18"/>
-          <w:szCs w:val="18"/>
-        </w:rPr>
-        <w:t>Midwest Missouri Valley Summer Bible Conference by UBF church</w:t>
-      </w:r>
-      <w:r>
-        <w:rPr>
-          <w:i/>
-          <w:iCs/>
-          <w:sz w:val="18"/>
-          <w:szCs w:val="18"/>
-        </w:rPr>
         <w:tab/>
         <w:t xml:space="preserve">                            </w:t>
       </w:r>
@@ -1963,7 +2129,55 @@
           <w:sz w:val="18"/>
           <w:szCs w:val="18"/>
         </w:rPr>
-        <w:t>May 2025 – June 2025</w:t>
+        <w:t>April</w:t>
+      </w:r>
+      <w:r>
+        <w:rPr>
+          <w:i/>
+          <w:sz w:val="18"/>
+          <w:szCs w:val="18"/>
+        </w:rPr>
+        <w:t xml:space="preserve"> 202</w:t>
+      </w:r>
+      <w:r>
+        <w:rPr>
+          <w:i/>
+          <w:sz w:val="18"/>
+          <w:szCs w:val="18"/>
+        </w:rPr>
+        <w:t>6</w:t>
+      </w:r>
+      <w:r>
+        <w:rPr>
+          <w:i/>
+          <w:sz w:val="18"/>
+          <w:szCs w:val="18"/>
+        </w:rPr>
+        <w:t xml:space="preserve"> – </w:t>
+      </w:r>
+      <w:r>
+        <w:rPr>
+          <w:i/>
+          <w:sz w:val="18"/>
+          <w:szCs w:val="18"/>
+        </w:rPr>
+        <w:t>May</w:t>
+      </w:r>
+      <w:r>
+        <w:rPr>
+          <w:i/>
+          <w:sz w:val="18"/>
+          <w:szCs w:val="18"/>
+        </w:rPr>
+        <w:t xml:space="preserve"> 202</w:t>
+      </w:r>
+      <w:r>
+        <w:rPr>
+          <w:i/>
+          <w:sz w:val="18"/>
+          <w:szCs w:val="18"/>
+        </w:rPr>
+        <w:t>7</w:t>
       </w:r>
     </w:p>
     <w:p>
@@ -1989,7 +2203,7 @@
           <w:sz w:val="18"/>
           <w:szCs w:val="18"/>
         </w:rPr>
-        <w:t>Collaborated with the housing team under a supervisor to help run and generate the room assignment VBA project.</w:t>
+        <w:t>Selected from a pool of 4300+ applicants for a competitive, technical 12-month AI program with Break Through Tech</w:t>
       </w:r>
     </w:p>
     <w:p>
@@ -2015,7 +2229,178 @@
           <w:sz w:val="18"/>
           <w:szCs w:val="18"/>
         </w:rPr>
-        <w:t>The ultimate goal is to pair people and sort according to request for the sake of assigning rooms in the dormitory</w:t>
+        <w:t>Completing Machine Learning coursework, technical projects, mentorship with industry professionals, and professional development workshops on topics including leadership, project management and career success</w:t>
+      </w:r>
+    </w:p>
+    <w:p>
+      <w:pPr>
+        <w:tabs>
+          <w:tab w:val="center" w:pos="2209"/>
+          <w:tab w:val="right" w:pos="10793"/>
+        </w:tabs>
+        <w:spacing w:after="1" w:line="240" w:lineRule="auto"/>
+        <w:rPr>
+          <w:sz w:val="18"/>
+          <w:szCs w:val="18"/>
+        </w:rPr>
+      </w:pPr>
+    </w:p>
+    <w:p>
+      <w:pPr>
+        <w:tabs>
+          <w:tab w:val="center" w:pos="2209"/>
+          <w:tab w:val="right" w:pos="10793"/>
+        </w:tabs>
+        <w:spacing w:after="1" w:line="240" w:lineRule="auto"/>
+        <w:ind w:left="0"/>
+        <w:rPr>
+          <w:b/>
+          <w:bCs/>
+          <w:sz w:val="18"/>
+          <w:szCs w:val="18"/>
+        </w:rPr>
+      </w:pPr>
+      <w:r>
+        <w:rPr>
+          <w:b/>
+          <w:bCs/>
+          <w:sz w:val="18"/>
+          <w:szCs w:val="18"/>
+        </w:rPr>
+        <w:t xml:space="preserve">Conference volunteer </w:t>
+      </w:r>
+      <w:r>
+        <w:rPr>
+          <w:b/>
+          <w:bCs/>
+          <w:sz w:val="18"/>
+          <w:szCs w:val="18"/>
+        </w:rPr>
+        <w:t xml:space="preserve"> |</w:t>
+      </w:r>
+      <w:r>
+        <w:rPr>
+          <w:i/>
+          <w:iCs/>
+          <w:sz w:val="18"/>
+          <w:szCs w:val="18"/>
+        </w:rPr>
+        <w:t xml:space="preserve"> </w:t>
+      </w:r>
+      <w:r>
+        <w:rPr>
+          <w:i/>
+          <w:iCs/>
+          <w:sz w:val="18"/>
+          <w:szCs w:val="18"/>
+        </w:rPr>
+        <w:t>Midwest Missouri Valley Summer Bible Conference by UBF church</w:t>
+      </w:r>
+      <w:r>
+        <w:rPr>
+          <w:i/>
+          <w:iCs/>
+          <w:sz w:val="18"/>
+          <w:szCs w:val="18"/>
+        </w:rPr>
+        <w:tab/>
+        <w:t xml:space="preserve">                            </w:t>
+      </w:r>
+      <w:r>
+        <w:rPr>
+          <w:i/>
+          <w:sz w:val="18"/>
+          <w:szCs w:val="18"/>
+        </w:rPr>
+        <w:t xml:space="preserve"> </w:t>
+      </w:r>
+      <w:r>
+        <w:rPr>
+          <w:i/>
+          <w:sz w:val="18"/>
+          <w:szCs w:val="18"/>
+        </w:rPr>
+        <w:t>May 2025 – June 2025</w:t>
+      </w:r>
+    </w:p>
+    <w:p>
+      <w:pPr>
+        <w:pStyle w:val="ListParagraph"/>
+        <w:numPr>
+          <w:ilvl w:val="0"/>
+          <w:numId w:val="16"/>
+        </w:numPr>
+        <w:tabs>
+          <w:tab w:val="center" w:pos="2209"/>
+          <w:tab w:val="right" w:pos="10793"/>
+        </w:tabs>
+        <w:spacing w:after="1" w:line="240" w:lineRule="auto"/>
+        <w:ind w:left="450"/>
+        <w:rPr>
+          <w:sz w:val="18"/>
+          <w:szCs w:val="18"/>
+        </w:rPr>
+      </w:pPr>
+      <w:r>
+        <w:rPr>
+          <w:sz w:val="18"/>
+          <w:szCs w:val="18"/>
+        </w:rPr>
+        <w:t xml:space="preserve">Collaborated with the housing team under a supervisor to help run </w:t>
+      </w:r>
+      <w:r>
+        <w:rPr>
+          <w:sz w:val="18"/>
+          <w:szCs w:val="18"/>
+        </w:rPr>
+        <w:t xml:space="preserve">small algorithms </w:t>
+      </w:r>
+      <w:r>
+        <w:rPr>
+          <w:sz w:val="18"/>
+          <w:szCs w:val="18"/>
+        </w:rPr>
+        <w:t>and generate the room assignment</w:t>
+      </w:r>
+      <w:r>
+        <w:rPr>
+          <w:sz w:val="18"/>
+          <w:szCs w:val="18"/>
+        </w:rPr>
+        <w:t xml:space="preserve"> for our guests</w:t>
+      </w:r>
+    </w:p>
+    <w:p>
+      <w:pPr>
+        <w:pStyle w:val="ListParagraph"/>
+        <w:numPr>
+          <w:ilvl w:val="0"/>
+          <w:numId w:val="16"/>
+        </w:numPr>
+        <w:tabs>
+          <w:tab w:val="center" w:pos="2209"/>
+          <w:tab w:val="right" w:pos="10793"/>
+        </w:tabs>
+        <w:spacing w:after="1" w:line="240" w:lineRule="auto"/>
+        <w:ind w:left="450"/>
+        <w:rPr>
+          <w:sz w:val="18"/>
+          <w:szCs w:val="18"/>
+        </w:rPr>
+      </w:pPr>
+      <w:r>
+        <w:rPr>
+          <w:sz w:val="18"/>
+          <w:szCs w:val="18"/>
+        </w:rPr>
+        <w:t xml:space="preserve">Leveraged the Cvent site and Excel Visual Basic </w:t>
+      </w:r>
+      <w:r>
+        <w:rPr>
+          <w:sz w:val="18"/>
+          <w:szCs w:val="18"/>
+        </w:rPr>
+        <w:t>to pair people and sort according to request for the sake of assigning rooms in the dormitory</w:t>
       </w:r>
     </w:p>
     <w:p>
@@ -2142,7 +2527,7 @@
           <w:sz w:val="18"/>
           <w:szCs w:val="18"/>
         </w:rPr>
-        <w:t xml:space="preserve">Collaborated and worked within 10-people group on the minigame forum website for game enthusiasts using React + Vite.  </w:t>
+        <w:t xml:space="preserve">Collaborated and worked within 10-people group on the minigame forum website for game enthusiasts using React + Vite  </w:t>
       </w:r>
     </w:p>
     <w:p>

</xml_diff>